<commit_message>
Fase 2: CU-01 v2.0 actualizado al sistema implementado y EVI-01 v1.1
</commit_message>
<xml_diff>
--- a/Fase 2/Evidencias Proyecto/Evidencias de documentación/4. Evidencias de funcionamiento/SITRAFO_EVI-01_Evidencias_de_Funcionamiento.docx
+++ b/Fase 2/Evidencias Proyecto/Evidencias de documentación/4. Evidencias de funcionamiento/SITRAFO_EVI-01_Evidencias_de_Funcionamiento.docx
@@ -94,7 +94,7 @@
           <w:sz w:val="26"/>
           <w:szCs w:val="26"/>
         </w:rPr>
-        <w:t xml:space="preserve">EVI-01  ·  Versión 1.0</w:t>
+        <w:t xml:space="preserve">EVI-01  ·  Versión 1.1</w:t>
       </w:r>
     </w:p>
     <w:tbl>
@@ -362,7 +362,7 @@
                 <w:sz w:val="20"/>
                 <w:szCs w:val="20"/>
               </w:rPr>
-              <w:t xml:space="preserve">ERS-01; CU-01; SEC-01; ARQ-01</w:t>
+              <w:t xml:space="preserve">ERS-01; CU-01 v2.0; SEC-01; ARQ-01</w:t>
             </w:r>
           </w:p>
         </w:tc>
@@ -3326,7 +3326,7 @@
                 <w:sz w:val="18"/>
                 <w:szCs w:val="18"/>
               </w:rPr>
-              <w:t xml:space="preserve">CU-COM-07</w:t>
+              <w:t xml:space="preserve">CU-COM-07, CU-COM-15</w:t>
             </w:r>
           </w:p>
         </w:tc>
@@ -3384,7 +3384,7 @@
                 <w:sz w:val="18"/>
                 <w:szCs w:val="18"/>
               </w:rPr>
-              <w:t xml:space="preserve">HU-04, HU-13</w:t>
+              <w:t xml:space="preserve">HU-04</w:t>
             </w:r>
           </w:p>
         </w:tc>
@@ -3626,7 +3626,7 @@
                 <w:sz w:val="18"/>
                 <w:szCs w:val="18"/>
               </w:rPr>
-              <w:t xml:space="preserve">CU-PAG-02, CU-PAG-05</w:t>
+              <w:t xml:space="preserve">CU-PAG-02, CU-PAG-03</w:t>
             </w:r>
           </w:p>
         </w:tc>
@@ -3776,7 +3776,7 @@
                 <w:sz w:val="18"/>
                 <w:szCs w:val="18"/>
               </w:rPr>
-              <w:t xml:space="preserve">CU-OT-01 a CU-OT-03</w:t>
+              <w:t xml:space="preserve">CU-OT-01 a CU-OT-03, CU-OT-11</w:t>
             </w:r>
           </w:p>
         </w:tc>
@@ -4076,7 +4076,7 @@
                 <w:sz w:val="18"/>
                 <w:szCs w:val="18"/>
               </w:rPr>
-              <w:t xml:space="preserve">CU-CAL-02, CU-CAL-04, CU-CAL-05</w:t>
+              <w:t xml:space="preserve">CU-CAL-03, CU-CAL-04, CU-CAL-05</w:t>
             </w:r>
           </w:p>
         </w:tc>
@@ -4226,7 +4226,7 @@
                 <w:sz w:val="18"/>
                 <w:szCs w:val="18"/>
               </w:rPr>
-              <w:t xml:space="preserve">CU-OT-08, CU-OT-09</w:t>
+              <w:t xml:space="preserve">CU-OT-08, CU-PAG-01</w:t>
             </w:r>
           </w:p>
         </w:tc>
@@ -4376,7 +4376,7 @@
                 <w:sz w:val="18"/>
                 <w:szCs w:val="18"/>
               </w:rPr>
-              <w:t xml:space="preserve">CU-COM-12, CU-INV-06, CU-SEG-05</w:t>
+              <w:t xml:space="preserve">CU-COM-16, CU-INV-07, CU-SEG-05</w:t>
             </w:r>
           </w:p>
         </w:tc>
@@ -4526,7 +4526,7 @@
                 <w:sz w:val="18"/>
                 <w:szCs w:val="18"/>
               </w:rPr>
-              <w:t xml:space="preserve">CU-ADM-07</w:t>
+              <w:t xml:space="preserve">CU-REP-01</w:t>
             </w:r>
           </w:p>
         </w:tc>
@@ -4584,7 +4584,7 @@
                 <w:sz w:val="18"/>
                 <w:szCs w:val="18"/>
               </w:rPr>
-              <w:t xml:space="preserve">HU-12</w:t>
+              <w:t xml:space="preserve">—</w:t>
             </w:r>
           </w:p>
         </w:tc>
@@ -9699,6 +9699,127 @@
           </w:p>
         </w:tc>
       </w:tr>
+      <w:tr>
+        <w:trPr>
+          <w:cantSplit/>
+        </w:trPr>
+        <w:tc>
+          <w:tcPr>
+            <w:tcW w:type="dxa" w:w="1000"/>
+            <w:tcBorders>
+              <w:top w:val="single" w:color="8496B0" w:sz="4"/>
+              <w:left w:val="single" w:color="8496B0" w:sz="4"/>
+              <w:bottom w:val="single" w:color="8496B0" w:sz="4"/>
+              <w:right w:val="single" w:color="8496B0" w:sz="4"/>
+            </w:tcBorders>
+            <w:tcMar>
+              <w:top w:type="dxa" w:w="50"/>
+              <w:left w:type="dxa" w:w="90"/>
+              <w:bottom w:type="dxa" w:w="50"/>
+              <w:right w:type="dxa" w:w="90"/>
+            </w:tcMar>
+          </w:tcPr>
+          <w:p>
+            <w:r>
+              <w:rPr>
+                <w:rFonts w:ascii="Calibri" w:cs="Calibri" w:eastAsia="Calibri" w:hAnsi="Calibri"/>
+                <w:b w:val="false"/>
+                <w:bCs w:val="false"/>
+                <w:sz w:val="20"/>
+                <w:szCs w:val="20"/>
+              </w:rPr>
+              <w:t xml:space="preserve">1.1</w:t>
+            </w:r>
+          </w:p>
+        </w:tc>
+        <w:tc>
+          <w:tcPr>
+            <w:tcW w:type="dxa" w:w="1500"/>
+            <w:tcBorders>
+              <w:top w:val="single" w:color="8496B0" w:sz="4"/>
+              <w:left w:val="single" w:color="8496B0" w:sz="4"/>
+              <w:bottom w:val="single" w:color="8496B0" w:sz="4"/>
+              <w:right w:val="single" w:color="8496B0" w:sz="4"/>
+            </w:tcBorders>
+            <w:tcMar>
+              <w:top w:type="dxa" w:w="50"/>
+              <w:left w:type="dxa" w:w="90"/>
+              <w:bottom w:type="dxa" w:w="50"/>
+              <w:right w:type="dxa" w:w="90"/>
+            </w:tcMar>
+          </w:tcPr>
+          <w:p>
+            <w:r>
+              <w:rPr>
+                <w:rFonts w:ascii="Calibri" w:cs="Calibri" w:eastAsia="Calibri" w:hAnsi="Calibri"/>
+                <w:b w:val="false"/>
+                <w:bCs w:val="false"/>
+                <w:sz w:val="20"/>
+                <w:szCs w:val="20"/>
+              </w:rPr>
+              <w:t xml:space="preserve">09-10-2026</w:t>
+            </w:r>
+          </w:p>
+        </w:tc>
+        <w:tc>
+          <w:tcPr>
+            <w:tcW w:type="dxa" w:w="2300"/>
+            <w:tcBorders>
+              <w:top w:val="single" w:color="8496B0" w:sz="4"/>
+              <w:left w:val="single" w:color="8496B0" w:sz="4"/>
+              <w:bottom w:val="single" w:color="8496B0" w:sz="4"/>
+              <w:right w:val="single" w:color="8496B0" w:sz="4"/>
+            </w:tcBorders>
+            <w:tcMar>
+              <w:top w:type="dxa" w:w="50"/>
+              <w:left w:type="dxa" w:w="90"/>
+              <w:bottom w:type="dxa" w:w="50"/>
+              <w:right w:type="dxa" w:w="90"/>
+            </w:tcMar>
+          </w:tcPr>
+          <w:p>
+            <w:r>
+              <w:rPr>
+                <w:rFonts w:ascii="Calibri" w:cs="Calibri" w:eastAsia="Calibri" w:hAnsi="Calibri"/>
+                <w:b w:val="false"/>
+                <w:bCs w:val="false"/>
+                <w:sz w:val="20"/>
+                <w:szCs w:val="20"/>
+              </w:rPr>
+              <w:t xml:space="preserve">Benjamín Delgado Bravo</w:t>
+            </w:r>
+          </w:p>
+        </w:tc>
+        <w:tc>
+          <w:tcPr>
+            <w:tcW w:type="dxa" w:w="4560"/>
+            <w:tcBorders>
+              <w:top w:val="single" w:color="8496B0" w:sz="4"/>
+              <w:left w:val="single" w:color="8496B0" w:sz="4"/>
+              <w:bottom w:val="single" w:color="8496B0" w:sz="4"/>
+              <w:right w:val="single" w:color="8496B0" w:sz="4"/>
+            </w:tcBorders>
+            <w:tcMar>
+              <w:top w:type="dxa" w:w="50"/>
+              <w:left w:type="dxa" w:w="90"/>
+              <w:bottom w:type="dxa" w:w="50"/>
+              <w:right w:type="dxa" w:w="90"/>
+            </w:tcMar>
+          </w:tcPr>
+          <w:p>
+            <w:r>
+              <w:rPr>
+                <w:rFonts w:ascii="Calibri" w:cs="Calibri" w:eastAsia="Calibri" w:hAnsi="Calibri"/>
+                <w:b w:val="false"/>
+                <w:bCs w:val="false"/>
+                <w:sz w:val="20"/>
+                <w:szCs w:val="20"/>
+              </w:rPr>
+              <w:t xml:space="preserve">Se alinean los códigos de casos de uso e historias con el CU-01 v2.0.</w:t>
+            </w:r>
+          </w:p>
+        </w:tc>
+      </w:tr>
     </w:tbl>
     <w:p>
       <w:pPr>
@@ -9836,7 +9957,7 @@
         <w:sz w:val="16"/>
         <w:szCs w:val="16"/>
       </w:rPr>
-      <w:t xml:space="preserve">SITRAFO · EVI-01 Evidencias de Funcionamiento · v1.0</w:t>
+      <w:t xml:space="preserve">SITRAFO · EVI-01 Evidencias de Funcionamiento · v1.1</w:t>
     </w:r>
   </w:p>
 </w:hdr>

</xml_diff>

<commit_message>
Fase 2: EVI-01 v1.2 con la evidencia de aprobacion de calidad, pendientes y avisos
</commit_message>
<xml_diff>
--- a/Fase 2/Evidencias Proyecto/Evidencias de documentación/4. Evidencias de funcionamiento/SITRAFO_EVI-01_Evidencias_de_Funcionamiento.docx
+++ b/Fase 2/Evidencias Proyecto/Evidencias de documentación/4. Evidencias de funcionamiento/SITRAFO_EVI-01_Evidencias_de_Funcionamiento.docx
@@ -94,7 +94,7 @@
           <w:sz w:val="26"/>
           <w:szCs w:val="26"/>
         </w:rPr>
-        <w:t xml:space="preserve">EVI-01  ·  Versión 1.1</w:t>
+        <w:t xml:space="preserve">EVI-01  ·  Versión 1.2</w:t>
       </w:r>
     </w:p>
     <w:tbl>
@@ -362,7 +362,7 @@
                 <w:sz w:val="20"/>
                 <w:szCs w:val="20"/>
               </w:rPr>
-              <w:t xml:space="preserve">ERS-01; CU-01 v2.0; SEC-01; ARQ-01</w:t>
+              <w:t xml:space="preserve">ERS-01; CU-01 v2.1; SEC-01; ARQ-01 v1.1</w:t>
             </w:r>
           </w:p>
         </w:tc>
@@ -488,7 +488,7 @@
                 <w:sz w:val="20"/>
                 <w:szCs w:val="20"/>
               </w:rPr>
-              <w:t xml:space="preserve">12 pasos, 22 capturas</w:t>
+              <w:t xml:space="preserve">13 pasos, 27 capturas</w:t>
             </w:r>
           </w:p>
         </w:tc>
@@ -866,7 +866,7 @@
                 <w:sz w:val="20"/>
                 <w:szCs w:val="20"/>
               </w:rPr>
-              <w:t xml:space="preserve">9 de octubre de 2026</w:t>
+              <w:t xml:space="preserve">10 de octubre de 2026</w:t>
             </w:r>
           </w:p>
         </w:tc>
@@ -932,7 +932,16 @@
         <w:jc w:val="both"/>
       </w:pPr>
       <w:r>
-        <w:t xml:space="preserve">Todas las capturas se tomaron el 8 y el 9 de octubre de 2026 sobre el sistema publicado en https://sitrafo.onrender.com: la aplicación web del cliente en el navegador y la aplicación de escritorio (SITRAFO.exe) conectada a la API en https://sitrafo.onrender.com/api/v1, como se lee en la barra de estado de cada ventana. Los correos se recibieron en una casilla real a través de Brevo y el pago se procesó en el ambiente sandbox de PayPal.</w:t>
+        <w:t xml:space="preserve">Las capturas de las evidencias 1 a 12 se tomaron el 8 y el 9 de octubre de 2026 sobre el sistema publicado en https://sitrafo.onrender.com: la aplicación web del cliente en el navegador y la aplicación de escritorio (SITRAFO.exe) conectada a la API en https://sitrafo.onrender.com/api/v1, como se lee en la barra de estado de cada ventana. Los correos se recibieron en una casilla real a través de Brevo y el pago se procesó en el ambiente sandbox de PayPal.</w:t>
+      </w:r>
+    </w:p>
+    <w:p>
+      <w:pPr>
+        <w:spacing w:after="120"/>
+        <w:jc w:val="both"/>
+      </w:pPr>
+      <w:r>
+        <w:t xml:space="preserve">La evidencia 13 muestra funciones incorporadas el 10 de octubre de 2026 —aprobación explícita del control de calidad, bandeja de pendientes y avisos por correo entre roles— y se capturó ese mismo día sobre el sistema publicado, con la versión escritorio-v1.1 de SITRAFO.exe.</w:t>
       </w:r>
     </w:p>
     <w:p>
@@ -1869,7 +1878,7 @@
                 <w:sz w:val="18"/>
                 <w:szCs w:val="18"/>
               </w:rPr>
-              <w:t xml:space="preserve">2, 3, 11</w:t>
+              <w:t xml:space="preserve">2, 3, 11, 13</w:t>
             </w:r>
           </w:p>
         </w:tc>
@@ -2111,7 +2120,7 @@
                 <w:sz w:val="18"/>
                 <w:szCs w:val="18"/>
               </w:rPr>
-              <w:t xml:space="preserve">7, 10</w:t>
+              <w:t xml:space="preserve">7, 10, 13</w:t>
             </w:r>
           </w:p>
         </w:tc>
@@ -2353,7 +2362,7 @@
                 <w:sz w:val="18"/>
                 <w:szCs w:val="18"/>
               </w:rPr>
-              <w:t xml:space="preserve">9</w:t>
+              <w:t xml:space="preserve">9, 13</w:t>
             </w:r>
           </w:p>
         </w:tc>
@@ -4585,6 +4594,156 @@
                 <w:szCs w:val="18"/>
               </w:rPr>
               <w:t xml:space="preserve">—</w:t>
+            </w:r>
+          </w:p>
+        </w:tc>
+      </w:tr>
+      <w:tr>
+        <w:trPr>
+          <w:cantSplit/>
+        </w:trPr>
+        <w:tc>
+          <w:tcPr>
+            <w:tcW w:type="dxa" w:w="600"/>
+            <w:tcBorders>
+              <w:top w:val="single" w:color="8496B0" w:sz="4"/>
+              <w:left w:val="single" w:color="8496B0" w:sz="4"/>
+              <w:bottom w:val="single" w:color="8496B0" w:sz="4"/>
+              <w:right w:val="single" w:color="8496B0" w:sz="4"/>
+            </w:tcBorders>
+            <w:tcMar>
+              <w:top w:type="dxa" w:w="50"/>
+              <w:left w:type="dxa" w:w="90"/>
+              <w:bottom w:type="dxa" w:w="50"/>
+              <w:right w:type="dxa" w:w="90"/>
+            </w:tcMar>
+          </w:tcPr>
+          <w:p>
+            <w:r>
+              <w:rPr>
+                <w:rFonts w:ascii="Calibri" w:cs="Calibri" w:eastAsia="Calibri" w:hAnsi="Calibri"/>
+                <w:b w:val="false"/>
+                <w:bCs w:val="false"/>
+                <w:sz w:val="18"/>
+                <w:szCs w:val="18"/>
+              </w:rPr>
+              <w:t xml:space="preserve">13</w:t>
+            </w:r>
+          </w:p>
+        </w:tc>
+        <w:tc>
+          <w:tcPr>
+            <w:tcW w:type="dxa" w:w="3500"/>
+            <w:tcBorders>
+              <w:top w:val="single" w:color="8496B0" w:sz="4"/>
+              <w:left w:val="single" w:color="8496B0" w:sz="4"/>
+              <w:bottom w:val="single" w:color="8496B0" w:sz="4"/>
+              <w:right w:val="single" w:color="8496B0" w:sz="4"/>
+            </w:tcBorders>
+            <w:tcMar>
+              <w:top w:type="dxa" w:w="50"/>
+              <w:left w:type="dxa" w:w="90"/>
+              <w:bottom w:type="dxa" w:w="50"/>
+              <w:right w:type="dxa" w:w="90"/>
+            </w:tcMar>
+          </w:tcPr>
+          <w:p>
+            <w:r>
+              <w:rPr>
+                <w:rFonts w:ascii="Calibri" w:cs="Calibri" w:eastAsia="Calibri" w:hAnsi="Calibri"/>
+                <w:b w:val="false"/>
+                <w:bCs w:val="false"/>
+                <w:sz w:val="18"/>
+                <w:szCs w:val="18"/>
+              </w:rPr>
+              <w:t xml:space="preserve">Aprobación de calidad, bandeja de pendientes y avisos entre roles</w:t>
+            </w:r>
+          </w:p>
+        </w:tc>
+        <w:tc>
+          <w:tcPr>
+            <w:tcW w:type="dxa" w:w="2300"/>
+            <w:tcBorders>
+              <w:top w:val="single" w:color="8496B0" w:sz="4"/>
+              <w:left w:val="single" w:color="8496B0" w:sz="4"/>
+              <w:bottom w:val="single" w:color="8496B0" w:sz="4"/>
+              <w:right w:val="single" w:color="8496B0" w:sz="4"/>
+            </w:tcBorders>
+            <w:tcMar>
+              <w:top w:type="dxa" w:w="50"/>
+              <w:left w:type="dxa" w:w="90"/>
+              <w:bottom w:type="dxa" w:w="50"/>
+              <w:right w:type="dxa" w:w="90"/>
+            </w:tcMar>
+          </w:tcPr>
+          <w:p>
+            <w:r>
+              <w:rPr>
+                <w:rFonts w:ascii="Calibri" w:cs="Calibri" w:eastAsia="Calibri" w:hAnsi="Calibri"/>
+                <w:b w:val="false"/>
+                <w:bCs w:val="false"/>
+                <w:sz w:val="18"/>
+                <w:szCs w:val="18"/>
+              </w:rPr>
+              <w:t xml:space="preserve">CU-CAL-07, CU-OT-08, CU-REP-04, CU-REP-05</w:t>
+            </w:r>
+          </w:p>
+        </w:tc>
+        <w:tc>
+          <w:tcPr>
+            <w:tcW w:type="dxa" w:w="1500"/>
+            <w:tcBorders>
+              <w:top w:val="single" w:color="8496B0" w:sz="4"/>
+              <w:left w:val="single" w:color="8496B0" w:sz="4"/>
+              <w:bottom w:val="single" w:color="8496B0" w:sz="4"/>
+              <w:right w:val="single" w:color="8496B0" w:sz="4"/>
+            </w:tcBorders>
+            <w:tcMar>
+              <w:top w:type="dxa" w:w="50"/>
+              <w:left w:type="dxa" w:w="90"/>
+              <w:bottom w:type="dxa" w:w="50"/>
+              <w:right w:type="dxa" w:w="90"/>
+            </w:tcMar>
+          </w:tcPr>
+          <w:p>
+            <w:r>
+              <w:rPr>
+                <w:rFonts w:ascii="Calibri" w:cs="Calibri" w:eastAsia="Calibri" w:hAnsi="Calibri"/>
+                <w:b w:val="false"/>
+                <w:bCs w:val="false"/>
+                <w:sz w:val="18"/>
+                <w:szCs w:val="18"/>
+              </w:rPr>
+              <w:t xml:space="preserve">RN-12, RN-14</w:t>
+            </w:r>
+          </w:p>
+        </w:tc>
+        <w:tc>
+          <w:tcPr>
+            <w:tcW w:type="dxa" w:w="1460"/>
+            <w:tcBorders>
+              <w:top w:val="single" w:color="8496B0" w:sz="4"/>
+              <w:left w:val="single" w:color="8496B0" w:sz="4"/>
+              <w:bottom w:val="single" w:color="8496B0" w:sz="4"/>
+              <w:right w:val="single" w:color="8496B0" w:sz="4"/>
+            </w:tcBorders>
+            <w:tcMar>
+              <w:top w:type="dxa" w:w="50"/>
+              <w:left w:type="dxa" w:w="90"/>
+              <w:bottom w:type="dxa" w:w="50"/>
+              <w:right w:type="dxa" w:w="90"/>
+            </w:tcMar>
+          </w:tcPr>
+          <w:p>
+            <w:r>
+              <w:rPr>
+                <w:rFonts w:ascii="Calibri" w:cs="Calibri" w:eastAsia="Calibri" w:hAnsi="Calibri"/>
+                <w:b w:val="false"/>
+                <w:bCs w:val="false"/>
+                <w:sz w:val="18"/>
+                <w:szCs w:val="18"/>
+              </w:rPr>
+              <w:t xml:space="preserve">HU-09</w:t>
             </w:r>
           </w:p>
         </w:tc>
@@ -8166,6 +8325,21 @@
     </w:p>
     <w:p>
       <w:pPr>
+        <w:spacing w:after="160" w:before="80"/>
+      </w:pPr>
+      <w:r>
+        <w:rPr>
+          <w:i/>
+          <w:iCs/>
+          <w:color w:val="44546A"/>
+          <w:sz w:val="19"/>
+          <w:szCs w:val="19"/>
+        </w:rPr>
+        <w:t xml:space="preserve">Estas capturas son anteriores a la aprobación explícita del control (CU-CAL-07). Desde el 10 de octubre la orden pasa primero a «Liberada por calidad» cuando el inspector aprueba el control, y sólo entonces se puede cerrar (evidencia 13).</w:t>
+      </w:r>
+    </w:p>
+    <w:p>
+      <w:pPr>
         <w:pStyle w:val="Heading1"/>
         <w:pageBreakBefore/>
       </w:pPr>
@@ -8902,6 +9076,576 @@
         <w:pageBreakBefore/>
       </w:pPr>
       <w:r>
+        <w:t xml:space="preserve">Evidencia 13. Aprobación de calidad, bandeja de pendientes y avisos entre roles</w:t>
+      </w:r>
+    </w:p>
+    <w:tbl>
+      <w:tblPr>
+        <w:tblW w:type="dxa" w:w="9360"/>
+        <w:tblBorders>
+          <w:top w:val="single" w:color="auto" w:sz="4"/>
+          <w:left w:val="single" w:color="auto" w:sz="4"/>
+          <w:bottom w:val="single" w:color="auto" w:sz="4"/>
+          <w:right w:val="single" w:color="auto" w:sz="4"/>
+          <w:insideH w:val="single" w:color="auto" w:sz="4"/>
+          <w:insideV w:val="single" w:color="auto" w:sz="4"/>
+        </w:tblBorders>
+      </w:tblPr>
+      <w:tblGrid>
+        <w:gridCol w:w="2400"/>
+        <w:gridCol w:w="6960"/>
+      </w:tblGrid>
+      <w:tr>
+        <w:trPr>
+          <w:tblHeader/>
+        </w:trPr>
+        <w:tc>
+          <w:tcPr>
+            <w:tcW w:type="dxa" w:w="2400"/>
+            <w:tcBorders>
+              <w:top w:val="single" w:color="8496B0" w:sz="4"/>
+              <w:left w:val="single" w:color="8496B0" w:sz="4"/>
+              <w:bottom w:val="single" w:color="8496B0" w:sz="4"/>
+              <w:right w:val="single" w:color="8496B0" w:sz="4"/>
+            </w:tcBorders>
+            <w:shd w:fill="DCE4EF" w:color="auto" w:val="clear"/>
+            <w:tcMar>
+              <w:top w:type="dxa" w:w="50"/>
+              <w:left w:type="dxa" w:w="90"/>
+              <w:bottom w:type="dxa" w:w="50"/>
+              <w:right w:type="dxa" w:w="90"/>
+            </w:tcMar>
+          </w:tcPr>
+          <w:p>
+            <w:r>
+              <w:rPr>
+                <w:rFonts w:ascii="Calibri" w:cs="Calibri" w:eastAsia="Calibri" w:hAnsi="Calibri"/>
+                <w:b/>
+                <w:bCs/>
+                <w:sz w:val="18"/>
+                <w:szCs w:val="18"/>
+              </w:rPr>
+              <w:t xml:space="preserve">Campo</w:t>
+            </w:r>
+          </w:p>
+        </w:tc>
+        <w:tc>
+          <w:tcPr>
+            <w:tcW w:type="dxa" w:w="6960"/>
+            <w:tcBorders>
+              <w:top w:val="single" w:color="8496B0" w:sz="4"/>
+              <w:left w:val="single" w:color="8496B0" w:sz="4"/>
+              <w:bottom w:val="single" w:color="8496B0" w:sz="4"/>
+              <w:right w:val="single" w:color="8496B0" w:sz="4"/>
+            </w:tcBorders>
+            <w:shd w:fill="DCE4EF" w:color="auto" w:val="clear"/>
+            <w:tcMar>
+              <w:top w:type="dxa" w:w="50"/>
+              <w:left w:type="dxa" w:w="90"/>
+              <w:bottom w:type="dxa" w:w="50"/>
+              <w:right w:type="dxa" w:w="90"/>
+            </w:tcMar>
+          </w:tcPr>
+          <w:p>
+            <w:r>
+              <w:rPr>
+                <w:rFonts w:ascii="Calibri" w:cs="Calibri" w:eastAsia="Calibri" w:hAnsi="Calibri"/>
+                <w:b/>
+                <w:bCs/>
+                <w:sz w:val="18"/>
+                <w:szCs w:val="18"/>
+              </w:rPr>
+              <w:t xml:space="preserve">Detalle</w:t>
+            </w:r>
+          </w:p>
+        </w:tc>
+      </w:tr>
+      <w:tr>
+        <w:trPr>
+          <w:cantSplit/>
+        </w:trPr>
+        <w:tc>
+          <w:tcPr>
+            <w:tcW w:type="dxa" w:w="2400"/>
+            <w:tcBorders>
+              <w:top w:val="single" w:color="8496B0" w:sz="4"/>
+              <w:left w:val="single" w:color="8496B0" w:sz="4"/>
+              <w:bottom w:val="single" w:color="8496B0" w:sz="4"/>
+              <w:right w:val="single" w:color="8496B0" w:sz="4"/>
+            </w:tcBorders>
+            <w:tcMar>
+              <w:top w:type="dxa" w:w="50"/>
+              <w:left w:type="dxa" w:w="90"/>
+              <w:bottom w:type="dxa" w:w="50"/>
+              <w:right w:type="dxa" w:w="90"/>
+            </w:tcMar>
+          </w:tcPr>
+          <w:p>
+            <w:r>
+              <w:rPr>
+                <w:rFonts w:ascii="Calibri" w:cs="Calibri" w:eastAsia="Calibri" w:hAnsi="Calibri"/>
+                <w:b w:val="false"/>
+                <w:bCs w:val="false"/>
+                <w:sz w:val="18"/>
+                <w:szCs w:val="18"/>
+              </w:rPr>
+              <w:t xml:space="preserve">Usuario / interfaz</w:t>
+            </w:r>
+          </w:p>
+        </w:tc>
+        <w:tc>
+          <w:tcPr>
+            <w:tcW w:type="dxa" w:w="6960"/>
+            <w:tcBorders>
+              <w:top w:val="single" w:color="8496B0" w:sz="4"/>
+              <w:left w:val="single" w:color="8496B0" w:sz="4"/>
+              <w:bottom w:val="single" w:color="8496B0" w:sz="4"/>
+              <w:right w:val="single" w:color="8496B0" w:sz="4"/>
+            </w:tcBorders>
+            <w:tcMar>
+              <w:top w:type="dxa" w:w="50"/>
+              <w:left w:type="dxa" w:w="90"/>
+              <w:bottom w:type="dxa" w:w="50"/>
+              <w:right w:type="dxa" w:w="90"/>
+            </w:tcMar>
+          </w:tcPr>
+          <w:p>
+            <w:r>
+              <w:rPr>
+                <w:rFonts w:ascii="Calibri" w:cs="Calibri" w:eastAsia="Calibri" w:hAnsi="Calibri"/>
+                <w:b w:val="false"/>
+                <w:bCs w:val="false"/>
+                <w:sz w:val="18"/>
+                <w:szCs w:val="18"/>
+              </w:rPr>
+              <w:t xml:space="preserve">calidad, produccion y comercial · escritorio (SITRAFO.exe v1.1); casilla de correo</w:t>
+            </w:r>
+          </w:p>
+        </w:tc>
+      </w:tr>
+      <w:tr>
+        <w:trPr>
+          <w:cantSplit/>
+        </w:trPr>
+        <w:tc>
+          <w:tcPr>
+            <w:tcW w:type="dxa" w:w="2400"/>
+            <w:tcBorders>
+              <w:top w:val="single" w:color="8496B0" w:sz="4"/>
+              <w:left w:val="single" w:color="8496B0" w:sz="4"/>
+              <w:bottom w:val="single" w:color="8496B0" w:sz="4"/>
+              <w:right w:val="single" w:color="8496B0" w:sz="4"/>
+            </w:tcBorders>
+            <w:tcMar>
+              <w:top w:type="dxa" w:w="50"/>
+              <w:left w:type="dxa" w:w="90"/>
+              <w:bottom w:type="dxa" w:w="50"/>
+              <w:right w:type="dxa" w:w="90"/>
+            </w:tcMar>
+          </w:tcPr>
+          <w:p>
+            <w:r>
+              <w:rPr>
+                <w:rFonts w:ascii="Calibri" w:cs="Calibri" w:eastAsia="Calibri" w:hAnsi="Calibri"/>
+                <w:b w:val="false"/>
+                <w:bCs w:val="false"/>
+                <w:sz w:val="18"/>
+                <w:szCs w:val="18"/>
+              </w:rPr>
+              <w:t xml:space="preserve">Reglas verificadas</w:t>
+            </w:r>
+          </w:p>
+        </w:tc>
+        <w:tc>
+          <w:tcPr>
+            <w:tcW w:type="dxa" w:w="6960"/>
+            <w:tcBorders>
+              <w:top w:val="single" w:color="8496B0" w:sz="4"/>
+              <w:left w:val="single" w:color="8496B0" w:sz="4"/>
+              <w:bottom w:val="single" w:color="8496B0" w:sz="4"/>
+              <w:right w:val="single" w:color="8496B0" w:sz="4"/>
+            </w:tcBorders>
+            <w:tcMar>
+              <w:top w:type="dxa" w:w="50"/>
+              <w:left w:type="dxa" w:w="90"/>
+              <w:bottom w:type="dxa" w:w="50"/>
+              <w:right w:type="dxa" w:w="90"/>
+            </w:tcMar>
+          </w:tcPr>
+          <w:p>
+            <w:r>
+              <w:rPr>
+                <w:rFonts w:ascii="Calibri" w:cs="Calibri" w:eastAsia="Calibri" w:hAnsi="Calibri"/>
+                <w:b w:val="false"/>
+                <w:bCs w:val="false"/>
+                <w:sz w:val="18"/>
+                <w:szCs w:val="18"/>
+              </w:rPr>
+              <w:t xml:space="preserve">RN-12 (la orden se cierra sólo después de que el inspector aprueba el control), RN-14 (el cambio a «Liberada por calidad» queda en el historial)</w:t>
+            </w:r>
+          </w:p>
+        </w:tc>
+      </w:tr>
+    </w:tbl>
+    <w:p>
+      <w:pPr>
+        <w:spacing w:after="60"/>
+      </w:pPr>
+    </w:p>
+    <w:p>
+      <w:pPr>
+        <w:spacing w:after="120"/>
+        <w:jc w:val="both"/>
+      </w:pPr>
+      <w:r>
+        <w:t xml:space="preserve">El inspector abre en Control de calidad la OT-2026-0006 (transformador monofásico de 25 kVA, OC-2026-0005). Los siete ensayos obligatorios del protocolo «Ensayos de rutina v1» están conformes; el nivel de ruido, que no es obligatorio, sigue pendiente y no impide la aprobación. El control queda «Conforme», se habilita «Aprobar y liberar la orden» y, tras confirmar, el sistema informa que la orden quedó liberada y que el jefe de producción ya puede cerrarla.</w:t>
+      </w:r>
+    </w:p>
+    <w:p>
+      <w:pPr>
+        <w:spacing w:after="120"/>
+        <w:jc w:val="both"/>
+      </w:pPr>
+      <w:r>
+        <w:t xml:space="preserve">Resultado observado: la OT-2026-0006 sale de la lista de calidad. Los usuarios con permiso para operar órdenes de trabajo reciben el aviso «orden de trabajo OT-2026-0006 liberada por calidad», cada uno en su propio correo (alias de la casilla del equipo), y el jefe de producción ve en Inicio, destacado, el pendiente «Cerrar la orden OT-2026-0006 (liberada por calidad)», junto con la generación de órdenes de trabajo de una compra con el anticipo pagado y el contador «Inicio (2)» en el menú. La bandeja del ejecutivo comercial muestra, en cambio, los pendientes de su rol: dos solicitudes por cotizar y un borrador sin emitir.</w:t>
+      </w:r>
+    </w:p>
+    <w:p>
+      <w:pPr>
+        <w:keepNext/>
+        <w:spacing w:before="120"/>
+        <w:jc w:val="center"/>
+      </w:pPr>
+      <w:r>
+        <w:drawing>
+          <wp:inline distT="0" distB="0" distL="0" distR="0">
+            <wp:extent cx="5943600" cy="3181350"/>
+            <wp:effectExtent t="0" r="0" b="0" l="0"/>
+            <wp:docPr id="1" name="Figura 23. Control conforme con el botón «Aprobar y liberar la orden» habilitado (sesión calidad)." descr="Figura 23. Control conforme con el botón «Aprobar y liberar la orden» habilitado (sesión calidad)." title="Figura 23. Control conforme con el botón «Aprobar y liberar la orden» habilitado (sesión calidad)."/>
+            <wp:cNvGraphicFramePr>
+              <a:graphicFrameLocks xmlns:a="http://schemas.openxmlformats.org/drawingml/2006/main" noChangeAspect="1"/>
+            </wp:cNvGraphicFramePr>
+            <a:graphic xmlns:a="http://schemas.openxmlformats.org/drawingml/2006/main">
+              <a:graphicData uri="http://schemas.openxmlformats.org/drawingml/2006/picture">
+                <pic:pic xmlns:pic="http://schemas.openxmlformats.org/drawingml/2006/picture">
+                  <pic:nvPicPr>
+                    <pic:cNvPr id="0" name="" descr=""/>
+                    <pic:cNvPicPr>
+                      <a:picLocks noChangeAspect="1" noChangeArrowheads="1"/>
+                    </pic:cNvPicPr>
+                  </pic:nvPicPr>
+                  <pic:blipFill>
+                    <a:blip r:embed="rId30" cstate="none"/>
+                    <a:srcRect/>
+                    <a:stretch>
+                      <a:fillRect/>
+                    </a:stretch>
+                  </pic:blipFill>
+                  <pic:spPr bwMode="auto">
+                    <a:xfrm>
+                      <a:off x="0" y="0"/>
+                      <a:ext cx="5943600" cy="3181350"/>
+                    </a:xfrm>
+                    <a:prstGeom prst="rect">
+                      <a:avLst/>
+                    </a:prstGeom>
+                  </pic:spPr>
+                </pic:pic>
+              </a:graphicData>
+            </a:graphic>
+          </wp:inline>
+        </w:drawing>
+      </w:r>
+    </w:p>
+    <w:p>
+      <w:pPr>
+        <w:spacing w:after="200"/>
+        <w:jc w:val="center"/>
+      </w:pPr>
+      <w:r>
+        <w:rPr>
+          <w:i/>
+          <w:iCs/>
+          <w:color w:val="44546A"/>
+          <w:sz w:val="18"/>
+          <w:szCs w:val="18"/>
+        </w:rPr>
+        <w:t xml:space="preserve">Figura 23. Control conforme con el botón «Aprobar y liberar la orden» habilitado (sesión calidad).</w:t>
+      </w:r>
+    </w:p>
+    <w:p>
+      <w:pPr>
+        <w:keepNext/>
+        <w:spacing w:before="120"/>
+        <w:jc w:val="center"/>
+      </w:pPr>
+      <w:r>
+        <w:drawing>
+          <wp:inline distT="0" distB="0" distL="0" distR="0">
+            <wp:extent cx="5943600" cy="3190875"/>
+            <wp:effectExtent t="0" r="0" b="0" l="0"/>
+            <wp:docPr id="1" name="Figura 24. Confirmación de la orden liberada por calidad." descr="Figura 24. Confirmación de la orden liberada por calidad." title="Figura 24. Confirmación de la orden liberada por calidad."/>
+            <wp:cNvGraphicFramePr>
+              <a:graphicFrameLocks xmlns:a="http://schemas.openxmlformats.org/drawingml/2006/main" noChangeAspect="1"/>
+            </wp:cNvGraphicFramePr>
+            <a:graphic xmlns:a="http://schemas.openxmlformats.org/drawingml/2006/main">
+              <a:graphicData uri="http://schemas.openxmlformats.org/drawingml/2006/picture">
+                <pic:pic xmlns:pic="http://schemas.openxmlformats.org/drawingml/2006/picture">
+                  <pic:nvPicPr>
+                    <pic:cNvPr id="0" name="" descr=""/>
+                    <pic:cNvPicPr>
+                      <a:picLocks noChangeAspect="1" noChangeArrowheads="1"/>
+                    </pic:cNvPicPr>
+                  </pic:nvPicPr>
+                  <pic:blipFill>
+                    <a:blip r:embed="rId31" cstate="none"/>
+                    <a:srcRect/>
+                    <a:stretch>
+                      <a:fillRect/>
+                    </a:stretch>
+                  </pic:blipFill>
+                  <pic:spPr bwMode="auto">
+                    <a:xfrm>
+                      <a:off x="0" y="0"/>
+                      <a:ext cx="5943600" cy="3190875"/>
+                    </a:xfrm>
+                    <a:prstGeom prst="rect">
+                      <a:avLst/>
+                    </a:prstGeom>
+                  </pic:spPr>
+                </pic:pic>
+              </a:graphicData>
+            </a:graphic>
+          </wp:inline>
+        </w:drawing>
+      </w:r>
+    </w:p>
+    <w:p>
+      <w:pPr>
+        <w:spacing w:after="200"/>
+        <w:jc w:val="center"/>
+      </w:pPr>
+      <w:r>
+        <w:rPr>
+          <w:i/>
+          <w:iCs/>
+          <w:color w:val="44546A"/>
+          <w:sz w:val="18"/>
+          <w:szCs w:val="18"/>
+        </w:rPr>
+        <w:t xml:space="preserve">Figura 24. Confirmación de la orden liberada por calidad.</w:t>
+      </w:r>
+    </w:p>
+    <w:p>
+      <w:pPr>
+        <w:keepNext/>
+        <w:spacing w:before="120"/>
+        <w:jc w:val="center"/>
+      </w:pPr>
+      <w:r>
+        <w:drawing>
+          <wp:inline distT="0" distB="0" distL="0" distR="0">
+            <wp:extent cx="5943600" cy="3190875"/>
+            <wp:effectExtent t="0" r="0" b="0" l="0"/>
+            <wp:docPr id="1" name="Figura 25. Bandeja de pendientes del jefe de producción con la orden liberada para cerrar." descr="Figura 25. Bandeja de pendientes del jefe de producción con la orden liberada para cerrar." title="Figura 25. Bandeja de pendientes del jefe de producción con la orden liberada para cerrar."/>
+            <wp:cNvGraphicFramePr>
+              <a:graphicFrameLocks xmlns:a="http://schemas.openxmlformats.org/drawingml/2006/main" noChangeAspect="1"/>
+            </wp:cNvGraphicFramePr>
+            <a:graphic xmlns:a="http://schemas.openxmlformats.org/drawingml/2006/main">
+              <a:graphicData uri="http://schemas.openxmlformats.org/drawingml/2006/picture">
+                <pic:pic xmlns:pic="http://schemas.openxmlformats.org/drawingml/2006/picture">
+                  <pic:nvPicPr>
+                    <pic:cNvPr id="0" name="" descr=""/>
+                    <pic:cNvPicPr>
+                      <a:picLocks noChangeAspect="1" noChangeArrowheads="1"/>
+                    </pic:cNvPicPr>
+                  </pic:nvPicPr>
+                  <pic:blipFill>
+                    <a:blip r:embed="rId32" cstate="none"/>
+                    <a:srcRect/>
+                    <a:stretch>
+                      <a:fillRect/>
+                    </a:stretch>
+                  </pic:blipFill>
+                  <pic:spPr bwMode="auto">
+                    <a:xfrm>
+                      <a:off x="0" y="0"/>
+                      <a:ext cx="5943600" cy="3190875"/>
+                    </a:xfrm>
+                    <a:prstGeom prst="rect">
+                      <a:avLst/>
+                    </a:prstGeom>
+                  </pic:spPr>
+                </pic:pic>
+              </a:graphicData>
+            </a:graphic>
+          </wp:inline>
+        </w:drawing>
+      </w:r>
+    </w:p>
+    <w:p>
+      <w:pPr>
+        <w:spacing w:after="200"/>
+        <w:jc w:val="center"/>
+      </w:pPr>
+      <w:r>
+        <w:rPr>
+          <w:i/>
+          <w:iCs/>
+          <w:color w:val="44546A"/>
+          <w:sz w:val="18"/>
+          <w:szCs w:val="18"/>
+        </w:rPr>
+        <w:t xml:space="preserve">Figura 25. Bandeja de pendientes del jefe de producción con la orden liberada para cerrar.</w:t>
+      </w:r>
+    </w:p>
+    <w:p>
+      <w:pPr>
+        <w:keepNext/>
+        <w:spacing w:before="120"/>
+        <w:jc w:val="center"/>
+      </w:pPr>
+      <w:r>
+        <w:drawing>
+          <wp:inline distT="0" distB="0" distL="0" distR="0">
+            <wp:extent cx="5943600" cy="2914650"/>
+            <wp:effectExtent t="0" r="0" b="0" l="0"/>
+            <wp:docPr id="1" name="Figura 26. Aviso interno por correo a los usuarios que operan las órdenes de trabajo." descr="Figura 26. Aviso interno por correo a los usuarios que operan las órdenes de trabajo." title="Figura 26. Aviso interno por correo a los usuarios que operan las órdenes de trabajo."/>
+            <wp:cNvGraphicFramePr>
+              <a:graphicFrameLocks xmlns:a="http://schemas.openxmlformats.org/drawingml/2006/main" noChangeAspect="1"/>
+            </wp:cNvGraphicFramePr>
+            <a:graphic xmlns:a="http://schemas.openxmlformats.org/drawingml/2006/main">
+              <a:graphicData uri="http://schemas.openxmlformats.org/drawingml/2006/picture">
+                <pic:pic xmlns:pic="http://schemas.openxmlformats.org/drawingml/2006/picture">
+                  <pic:nvPicPr>
+                    <pic:cNvPr id="0" name="" descr=""/>
+                    <pic:cNvPicPr>
+                      <a:picLocks noChangeAspect="1" noChangeArrowheads="1"/>
+                    </pic:cNvPicPr>
+                  </pic:nvPicPr>
+                  <pic:blipFill>
+                    <a:blip r:embed="rId33" cstate="none"/>
+                    <a:srcRect/>
+                    <a:stretch>
+                      <a:fillRect/>
+                    </a:stretch>
+                  </pic:blipFill>
+                  <pic:spPr bwMode="auto">
+                    <a:xfrm>
+                      <a:off x="0" y="0"/>
+                      <a:ext cx="5943600" cy="2914650"/>
+                    </a:xfrm>
+                    <a:prstGeom prst="rect">
+                      <a:avLst/>
+                    </a:prstGeom>
+                  </pic:spPr>
+                </pic:pic>
+              </a:graphicData>
+            </a:graphic>
+          </wp:inline>
+        </w:drawing>
+      </w:r>
+    </w:p>
+    <w:p>
+      <w:pPr>
+        <w:spacing w:after="200"/>
+        <w:jc w:val="center"/>
+      </w:pPr>
+      <w:r>
+        <w:rPr>
+          <w:i/>
+          <w:iCs/>
+          <w:color w:val="44546A"/>
+          <w:sz w:val="18"/>
+          <w:szCs w:val="18"/>
+        </w:rPr>
+        <w:t xml:space="preserve">Figura 26. Aviso interno por correo a los usuarios que operan las órdenes de trabajo.</w:t>
+      </w:r>
+    </w:p>
+    <w:p>
+      <w:pPr>
+        <w:keepNext/>
+        <w:spacing w:before="120"/>
+        <w:jc w:val="center"/>
+      </w:pPr>
+      <w:r>
+        <w:drawing>
+          <wp:inline distT="0" distB="0" distL="0" distR="0">
+            <wp:extent cx="5943600" cy="3190875"/>
+            <wp:effectExtent t="0" r="0" b="0" l="0"/>
+            <wp:docPr id="1" name="Figura 27. Bandeja de pendientes del ejecutivo comercial." descr="Figura 27. Bandeja de pendientes del ejecutivo comercial." title="Figura 27. Bandeja de pendientes del ejecutivo comercial."/>
+            <wp:cNvGraphicFramePr>
+              <a:graphicFrameLocks xmlns:a="http://schemas.openxmlformats.org/drawingml/2006/main" noChangeAspect="1"/>
+            </wp:cNvGraphicFramePr>
+            <a:graphic xmlns:a="http://schemas.openxmlformats.org/drawingml/2006/main">
+              <a:graphicData uri="http://schemas.openxmlformats.org/drawingml/2006/picture">
+                <pic:pic xmlns:pic="http://schemas.openxmlformats.org/drawingml/2006/picture">
+                  <pic:nvPicPr>
+                    <pic:cNvPr id="0" name="" descr=""/>
+                    <pic:cNvPicPr>
+                      <a:picLocks noChangeAspect="1" noChangeArrowheads="1"/>
+                    </pic:cNvPicPr>
+                  </pic:nvPicPr>
+                  <pic:blipFill>
+                    <a:blip r:embed="rId34" cstate="none"/>
+                    <a:srcRect/>
+                    <a:stretch>
+                      <a:fillRect/>
+                    </a:stretch>
+                  </pic:blipFill>
+                  <pic:spPr bwMode="auto">
+                    <a:xfrm>
+                      <a:off x="0" y="0"/>
+                      <a:ext cx="5943600" cy="3190875"/>
+                    </a:xfrm>
+                    <a:prstGeom prst="rect">
+                      <a:avLst/>
+                    </a:prstGeom>
+                  </pic:spPr>
+                </pic:pic>
+              </a:graphicData>
+            </a:graphic>
+          </wp:inline>
+        </w:drawing>
+      </w:r>
+    </w:p>
+    <w:p>
+      <w:pPr>
+        <w:spacing w:after="200"/>
+        <w:jc w:val="center"/>
+      </w:pPr>
+      <w:r>
+        <w:rPr>
+          <w:i/>
+          <w:iCs/>
+          <w:color w:val="44546A"/>
+          <w:sz w:val="18"/>
+          <w:szCs w:val="18"/>
+        </w:rPr>
+        <w:t xml:space="preserve">Figura 27. Bandeja de pendientes del ejecutivo comercial.</w:t>
+      </w:r>
+    </w:p>
+    <w:p>
+      <w:pPr>
+        <w:spacing w:after="160" w:before="80"/>
+      </w:pPr>
+      <w:r>
+        <w:rPr>
+          <w:i/>
+          <w:iCs/>
+          <w:color w:val="44546A"/>
+          <w:sz w:val="19"/>
+          <w:szCs w:val="19"/>
+        </w:rPr>
+        <w:t xml:space="preserve">Al momento de la captura el servidor aún tenía activo el modo de redirección de correos, por lo que el aviso llegó a la casilla de control con los destinatarios originales indicados en el asunto. Con el modo de copia, cada destinatario lo recibe en su correo y la casilla de control recibe una copia oculta.</w:t>
+      </w:r>
+    </w:p>
+    <w:p>
+      <w:pPr>
+        <w:pStyle w:val="Heading1"/>
+        <w:pageBreakBefore/>
+      </w:pPr>
+      <w:r>
         <w:t xml:space="preserve">4. Hallazgos durante la recolección de evidencias</w:t>
       </w:r>
     </w:p>
@@ -9816,6 +10560,127 @@
                 <w:szCs w:val="20"/>
               </w:rPr>
               <w:t xml:space="preserve">Se alinean los códigos de casos de uso e historias con el CU-01 v2.0.</w:t>
+            </w:r>
+          </w:p>
+        </w:tc>
+      </w:tr>
+      <w:tr>
+        <w:trPr>
+          <w:cantSplit/>
+        </w:trPr>
+        <w:tc>
+          <w:tcPr>
+            <w:tcW w:type="dxa" w:w="1000"/>
+            <w:tcBorders>
+              <w:top w:val="single" w:color="8496B0" w:sz="4"/>
+              <w:left w:val="single" w:color="8496B0" w:sz="4"/>
+              <w:bottom w:val="single" w:color="8496B0" w:sz="4"/>
+              <w:right w:val="single" w:color="8496B0" w:sz="4"/>
+            </w:tcBorders>
+            <w:tcMar>
+              <w:top w:type="dxa" w:w="50"/>
+              <w:left w:type="dxa" w:w="90"/>
+              <w:bottom w:type="dxa" w:w="50"/>
+              <w:right w:type="dxa" w:w="90"/>
+            </w:tcMar>
+          </w:tcPr>
+          <w:p>
+            <w:r>
+              <w:rPr>
+                <w:rFonts w:ascii="Calibri" w:cs="Calibri" w:eastAsia="Calibri" w:hAnsi="Calibri"/>
+                <w:b w:val="false"/>
+                <w:bCs w:val="false"/>
+                <w:sz w:val="20"/>
+                <w:szCs w:val="20"/>
+              </w:rPr>
+              <w:t xml:space="preserve">1.2</w:t>
+            </w:r>
+          </w:p>
+        </w:tc>
+        <w:tc>
+          <w:tcPr>
+            <w:tcW w:type="dxa" w:w="1500"/>
+            <w:tcBorders>
+              <w:top w:val="single" w:color="8496B0" w:sz="4"/>
+              <w:left w:val="single" w:color="8496B0" w:sz="4"/>
+              <w:bottom w:val="single" w:color="8496B0" w:sz="4"/>
+              <w:right w:val="single" w:color="8496B0" w:sz="4"/>
+            </w:tcBorders>
+            <w:tcMar>
+              <w:top w:type="dxa" w:w="50"/>
+              <w:left w:type="dxa" w:w="90"/>
+              <w:bottom w:type="dxa" w:w="50"/>
+              <w:right w:type="dxa" w:w="90"/>
+            </w:tcMar>
+          </w:tcPr>
+          <w:p>
+            <w:r>
+              <w:rPr>
+                <w:rFonts w:ascii="Calibri" w:cs="Calibri" w:eastAsia="Calibri" w:hAnsi="Calibri"/>
+                <w:b w:val="false"/>
+                <w:bCs w:val="false"/>
+                <w:sz w:val="20"/>
+                <w:szCs w:val="20"/>
+              </w:rPr>
+              <w:t xml:space="preserve">10-10-2026</w:t>
+            </w:r>
+          </w:p>
+        </w:tc>
+        <w:tc>
+          <w:tcPr>
+            <w:tcW w:type="dxa" w:w="2300"/>
+            <w:tcBorders>
+              <w:top w:val="single" w:color="8496B0" w:sz="4"/>
+              <w:left w:val="single" w:color="8496B0" w:sz="4"/>
+              <w:bottom w:val="single" w:color="8496B0" w:sz="4"/>
+              <w:right w:val="single" w:color="8496B0" w:sz="4"/>
+            </w:tcBorders>
+            <w:tcMar>
+              <w:top w:type="dxa" w:w="50"/>
+              <w:left w:type="dxa" w:w="90"/>
+              <w:bottom w:type="dxa" w:w="50"/>
+              <w:right w:type="dxa" w:w="90"/>
+            </w:tcMar>
+          </w:tcPr>
+          <w:p>
+            <w:r>
+              <w:rPr>
+                <w:rFonts w:ascii="Calibri" w:cs="Calibri" w:eastAsia="Calibri" w:hAnsi="Calibri"/>
+                <w:b w:val="false"/>
+                <w:bCs w:val="false"/>
+                <w:sz w:val="20"/>
+                <w:szCs w:val="20"/>
+              </w:rPr>
+              <w:t xml:space="preserve">Benjamín Delgado Bravo</w:t>
+            </w:r>
+          </w:p>
+        </w:tc>
+        <w:tc>
+          <w:tcPr>
+            <w:tcW w:type="dxa" w:w="4560"/>
+            <w:tcBorders>
+              <w:top w:val="single" w:color="8496B0" w:sz="4"/>
+              <w:left w:val="single" w:color="8496B0" w:sz="4"/>
+              <w:bottom w:val="single" w:color="8496B0" w:sz="4"/>
+              <w:right w:val="single" w:color="8496B0" w:sz="4"/>
+            </w:tcBorders>
+            <w:tcMar>
+              <w:top w:type="dxa" w:w="50"/>
+              <w:left w:type="dxa" w:w="90"/>
+              <w:bottom w:type="dxa" w:w="50"/>
+              <w:right w:type="dxa" w:w="90"/>
+            </w:tcMar>
+          </w:tcPr>
+          <w:p>
+            <w:r>
+              <w:rPr>
+                <w:rFonts w:ascii="Calibri" w:cs="Calibri" w:eastAsia="Calibri" w:hAnsi="Calibri"/>
+                <w:b w:val="false"/>
+                <w:bCs w:val="false"/>
+                <w:sz w:val="20"/>
+                <w:szCs w:val="20"/>
+              </w:rPr>
+              <w:t xml:space="preserve">Se agrega la evidencia 13 (aprobación de calidad, bandeja de pendientes y avisos entre roles) y una nota en la evidencia 10.</w:t>
             </w:r>
           </w:p>
         </w:tc>
@@ -9957,7 +10822,7 @@
         <w:sz w:val="16"/>
         <w:szCs w:val="16"/>
       </w:rPr>
-      <w:t xml:space="preserve">SITRAFO · EVI-01 Evidencias de Funcionamiento · v1.1</w:t>
+      <w:t xml:space="preserve">SITRAFO · EVI-01 Evidencias de Funcionamiento · v1.2</w:t>
     </w:r>
   </w:p>
 </w:hdr>

</xml_diff>